<commit_message>
Ajuste 4 - Ajustado  Circuito_caixa_secagem para impressão
</commit_message>
<xml_diff>
--- a/code/proteus/Circuito.docx
+++ b/code/proteus/Circuito.docx
@@ -75,6 +75,103 @@
                     <a:xfrm>
                       <a:off x="0" y="0"/>
                       <a:ext cx="3808792" cy="3616650"/>
+                    </a:xfrm>
+                    <a:prstGeom prst="rect">
+                      <a:avLst/>
+                    </a:prstGeom>
+                  </pic:spPr>
+                </pic:pic>
+              </a:graphicData>
+            </a:graphic>
+          </wp:inline>
+        </w:drawing>
+      </w:r>
+    </w:p>
+    <w:p/>
+    <w:p>
+      <w:pPr>
+        <w:jc w:val="center"/>
+      </w:pPr>
+      <w:r>
+        <w:rPr>
+          <w:noProof/>
+        </w:rPr>
+        <w:lastRenderedPageBreak/>
+        <w:drawing>
+          <wp:inline distT="0" distB="0" distL="0" distR="0" wp14:anchorId="5BFD0D3C" wp14:editId="54A3784B">
+            <wp:extent cx="3867784" cy="2115820"/>
+            <wp:effectExtent l="0" t="0" r="0" b="0"/>
+            <wp:docPr id="549361395" name="Imagem 1"/>
+            <wp:cNvGraphicFramePr>
+              <a:graphicFrameLocks xmlns:a="http://schemas.openxmlformats.org/drawingml/2006/main" noChangeAspect="1"/>
+            </wp:cNvGraphicFramePr>
+            <a:graphic xmlns:a="http://schemas.openxmlformats.org/drawingml/2006/main">
+              <a:graphicData uri="http://schemas.openxmlformats.org/drawingml/2006/picture">
+                <pic:pic xmlns:pic="http://schemas.openxmlformats.org/drawingml/2006/picture">
+                  <pic:nvPicPr>
+                    <pic:cNvPr id="549361395" name=""/>
+                    <pic:cNvPicPr/>
+                  </pic:nvPicPr>
+                  <pic:blipFill>
+                    <a:blip r:embed="rId6"/>
+                    <a:stretch>
+                      <a:fillRect/>
+                    </a:stretch>
+                  </pic:blipFill>
+                  <pic:spPr>
+                    <a:xfrm>
+                      <a:off x="0" y="0"/>
+                      <a:ext cx="3875001" cy="2119768"/>
+                    </a:xfrm>
+                    <a:prstGeom prst="rect">
+                      <a:avLst/>
+                    </a:prstGeom>
+                  </pic:spPr>
+                </pic:pic>
+              </a:graphicData>
+            </a:graphic>
+          </wp:inline>
+        </w:drawing>
+      </w:r>
+    </w:p>
+    <w:p>
+      <w:pPr>
+        <w:jc w:val="center"/>
+      </w:pPr>
+    </w:p>
+    <w:p>
+      <w:pPr>
+        <w:jc w:val="center"/>
+      </w:pPr>
+      <w:r>
+        <w:rPr>
+          <w:noProof/>
+        </w:rPr>
+        <w:drawing>
+          <wp:inline distT="0" distB="0" distL="0" distR="0" wp14:anchorId="145B5FB7" wp14:editId="7FA4E5E6">
+            <wp:extent cx="5400040" cy="2620645"/>
+            <wp:effectExtent l="0" t="0" r="0" b="8255"/>
+            <wp:docPr id="600204398" name="Imagem 1"/>
+            <wp:cNvGraphicFramePr>
+              <a:graphicFrameLocks xmlns:a="http://schemas.openxmlformats.org/drawingml/2006/main" noChangeAspect="1"/>
+            </wp:cNvGraphicFramePr>
+            <a:graphic xmlns:a="http://schemas.openxmlformats.org/drawingml/2006/main">
+              <a:graphicData uri="http://schemas.openxmlformats.org/drawingml/2006/picture">
+                <pic:pic xmlns:pic="http://schemas.openxmlformats.org/drawingml/2006/picture">
+                  <pic:nvPicPr>
+                    <pic:cNvPr id="600204398" name=""/>
+                    <pic:cNvPicPr/>
+                  </pic:nvPicPr>
+                  <pic:blipFill>
+                    <a:blip r:embed="rId7"/>
+                    <a:stretch>
+                      <a:fillRect/>
+                    </a:stretch>
+                  </pic:blipFill>
+                  <pic:spPr>
+                    <a:xfrm>
+                      <a:off x="0" y="0"/>
+                      <a:ext cx="5400040" cy="2620645"/>
                     </a:xfrm>
                     <a:prstGeom prst="rect">
                       <a:avLst/>

</xml_diff>